<commit_message>
Integrert AISStream (Hormuz) og sanntids oljepriser i beslutningsmodellen og rapporten (ekskl. store filer)
</commit_message>
<xml_diff>
--- a/014 fase 4 - report/Prosjektrapport_LOG650_G07_Oppdatert.docx
+++ b/014 fase 4 - report/Prosjektrapport_LOG650_G07_Oppdatert.docx
@@ -1021,10 +1021,7 @@
         <w:t xml:space="preserve">NewsAPI</w:t>
       </w:r>
       <w:r>
-        <w:t xml:space="preserve"> </w:t>
-      </w:r>
-      <w:r>
-        <w:t xml:space="preserve">og</w:t>
+        <w:t xml:space="preserve">,</w:t>
       </w:r>
       <w:r>
         <w:t xml:space="preserve"> </w:t>
@@ -1037,6 +1034,35 @@
         <w:t xml:space="preserve">OpenWeatherMap API</w:t>
       </w:r>
       <w:r>
+        <w:t xml:space="preserve">,</w:t>
+      </w:r>
+      <w:r>
+        <w:t xml:space="preserve"> </w:t>
+      </w:r>
+      <w:r>
+        <w:rPr>
+          <w:bCs/>
+          <w:b/>
+        </w:rPr>
+        <w:t xml:space="preserve">AlphaVantage</w:t>
+      </w:r>
+      <w:r>
+        <w:t xml:space="preserve"> </w:t>
+      </w:r>
+      <w:r>
+        <w:t xml:space="preserve">og</w:t>
+      </w:r>
+      <w:r>
+        <w:t xml:space="preserve"> </w:t>
+      </w:r>
+      <w:r>
+        <w:rPr>
+          <w:bCs/>
+          <w:b/>
+        </w:rPr>
+        <w:t xml:space="preserve">AISStream</w:t>
+      </w:r>
+      <w:r>
         <w:t xml:space="preserve">. Verktøyet henter nå automatisk sanntidsdata for å identifisere trusler før de påvirker forsyningskjeden:</w:t>
       </w:r>
       <w:r>
@@ -1059,7 +1085,7 @@
         <w:t xml:space="preserve"> </w:t>
       </w:r>
       <w:r>
-        <w:t xml:space="preserve">Analyserer nyhetsstrømmer for geopolitisk uro, streik og blokkeringer (f.eks. Suez-kanalen).</w:t>
+        <w:t xml:space="preserve">Analyserer nyhetsstrømmer for geopolitisk uro, streik og blokkeringer.</w:t>
       </w:r>
       <w:r>
         <w:t xml:space="preserve"> </w:t>
@@ -1081,7 +1107,7 @@
         <w:t xml:space="preserve"> </w:t>
       </w:r>
       <w:r>
-        <w:t xml:space="preserve">Henter faktiske værdata (vindstyrke, ekstremvær) for kritiske logistiske knutepunkter som Panama-kanalen, Shanghai, Rotterdam og Singapore.</w:t>
+        <w:t xml:space="preserve">Henter faktiske værdata for kritiske logistiske knutepunkter.</w:t>
       </w:r>
       <w:r>
         <w:t xml:space="preserve"> </w:t>
@@ -1097,13 +1123,80 @@
           <w:bCs/>
           <w:b/>
         </w:rPr>
-        <w:t xml:space="preserve">Dynamisk respons:</w:t>
-      </w:r>
-      <w:r>
-        <w:t xml:space="preserve"> </w:t>
-      </w:r>
-      <w:r>
-        <w:t xml:space="preserve">Hvis sanntidsrisikoen øker (f.eks. orkanvarsel eller økt konfliktnivå), vil beslutningsmodellen automatisk prioritere proaktive tiltak som omruting eller flyfrakt.</w:t>
+        <w:t xml:space="preserve">Maritime Bevegelser (AIS):</w:t>
+      </w:r>
+      <w:r>
+        <w:t xml:space="preserve"> </w:t>
+      </w:r>
+      <w:r>
+        <w:t xml:space="preserve">Overvåker skipstrafikk i sanntid via</w:t>
+      </w:r>
+      <w:r>
+        <w:t xml:space="preserve"> </w:t>
+      </w:r>
+      <w:r>
+        <w:rPr>
+          <w:bCs/>
+          <w:b/>
+        </w:rPr>
+        <w:t xml:space="preserve">AISStream</w:t>
+      </w:r>
+      <w:r>
+        <w:t xml:space="preserve">. Per 30. april 2026 ble det registrert kritisk lav trafikk i Hormuzstredet (0 skip i testvinduet), noe som utløser maksimal risiko for ruter i Midtøsten.</w:t>
+      </w:r>
+      <w:r>
+        <w:t xml:space="preserve"> </w:t>
+      </w:r>
+      <w:r>
+        <w:t xml:space="preserve">-</w:t>
+      </w:r>
+      <w:r>
+        <w:t xml:space="preserve"> </w:t>
+      </w:r>
+      <w:r>
+        <w:rPr>
+          <w:bCs/>
+          <w:b/>
+        </w:rPr>
+        <w:t xml:space="preserve">Energi og Råvarer:</w:t>
+      </w:r>
+      <w:r>
+        <w:t xml:space="preserve"> </w:t>
+      </w:r>
+      <w:r>
+        <w:t xml:space="preserve">Henter sanntids oljepriser (Brent Crude). Den nåværende prisen på</w:t>
+      </w:r>
+      <w:r>
+        <w:t xml:space="preserve"> </w:t>
+      </w:r>
+      <w:r>
+        <w:rPr>
+          <w:bCs/>
+          <w:b/>
+        </w:rPr>
+        <w:t xml:space="preserve">$110.83/fat</w:t>
+      </w:r>
+      <w:r>
+        <w:t xml:space="preserve"> </w:t>
+      </w:r>
+      <w:r>
+        <w:t xml:space="preserve">har ført til at modellen automatisk legger til et</w:t>
+      </w:r>
+      <w:r>
+        <w:t xml:space="preserve"> </w:t>
+      </w:r>
+      <w:r>
+        <w:rPr>
+          <w:bCs/>
+          <w:b/>
+        </w:rPr>
+        <w:t xml:space="preserve">15% drivstofftillegg</w:t>
+      </w:r>
+      <w:r>
+        <w:t xml:space="preserve"> </w:t>
+      </w:r>
+      <w:r>
+        <w:t xml:space="preserve">på alle transportberegninger.</w:t>
       </w:r>
     </w:p>
     <w:bookmarkEnd w:id="40"/>
@@ -1204,7 +1297,7 @@
         <w:pStyle w:val="FirstParagraph"/>
       </w:pPr>
       <w:r>
-        <w:t xml:space="preserve">Med sanntidsdata integrert (per 30. april 2026), viser modellen en mer proaktiv tilnærming:</w:t>
+        <w:t xml:space="preserve">Med sanntidsdata integrert (per 30. april 2026), inkludert den ekstreme oljeprisen og Hormuz-situasjonen, viser modellen en mer proaktiv, men kostbar tilnærming:</w:t>
       </w:r>
       <w:r>
         <w:t xml:space="preserve"> </w:t>
@@ -1226,7 +1319,7 @@
         <w:t xml:space="preserve"> </w:t>
       </w:r>
       <w:r>
-        <w:t xml:space="preserve">61.09%</w:t>
+        <w:t xml:space="preserve">209.64% (drevet av flyfrakt og 15% drivstofftillegg)</w:t>
       </w:r>
       <w:r>
         <w:t xml:space="preserve"> </w:t>
@@ -1248,7 +1341,7 @@
         <w:t xml:space="preserve"> </w:t>
       </w:r>
       <w:r>
-        <w:t xml:space="preserve">12.09%</w:t>
+        <w:t xml:space="preserve">12.68%</w:t>
       </w:r>
       <w:r>
         <w:t xml:space="preserve"> </w:t>
@@ -1270,7 +1363,7 @@
         <w:t xml:space="preserve"> </w:t>
       </w:r>
       <w:r>
-        <w:t xml:space="preserve">0.1979</w:t>
+        <w:t xml:space="preserve">0.0605</w:t>
       </w:r>
     </w:p>
     <w:p>

</xml_diff>